<commit_message>
Add authenticated Firebase content and engagement flows
</commit_message>
<xml_diff>
--- a/docs/PaperLoop_Work_Done_So_Far.docx
+++ b/docs/PaperLoop_Work_Done_So_Far.docx
@@ -1626,7 +1626,7 @@
         <w:pStyle w:val="Heading1"/>
       </w:pPr>
       <w:r>
-        <w:t>Wednesday MVP Checkpoint - Work Done Today</w:t>
+        <w:t>Day 3 MVP Checkpoint - Key Deliveries</w:t>
       </w:r>
     </w:p>
     <w:p>
@@ -1745,6 +1745,102 @@
         </w:tc>
       </w:tr>
     </w:tbl>
+    <w:p>
+      <w:pPr>
+        <w:pStyle w:val="PaperLoopBullet"/>
+      </w:pPr>
+      <w:r>
+        <w:t>Published edition visibility is now live in the Reader, so uploaded/published issues can be selected and opened by readers.</w:t>
+      </w:r>
+    </w:p>
+    <w:p>
+      <w:pPr>
+        <w:pStyle w:val="PaperLoopBullet"/>
+      </w:pPr>
+      <w:r>
+        <w:t>The uploaded source PDF is now visible from the Reader with an original-upload panel and an Open source PDF action.</w:t>
+      </w:r>
+    </w:p>
+    <w:p>
+      <w:pPr>
+        <w:pStyle w:val="PaperLoopBullet"/>
+      </w:pPr>
+      <w:r>
+        <w:t>The Reader edition selector now supports switching between published issues for the selected publisher.</w:t>
+      </w:r>
+    </w:p>
+    <w:p>
+      <w:pPr>
+        <w:pStyle w:val="PaperLoopBullet"/>
+      </w:pPr>
+      <w:r>
+        <w:t>The Admin workspace now shows preview pages for uploaded editions and includes a manual clipping form for staff.</w:t>
+      </w:r>
+    </w:p>
+    <w:p>
+      <w:pPr>
+        <w:pStyle w:val="PaperLoopBullet"/>
+      </w:pPr>
+      <w:r>
+        <w:t>Created the first clickable article hotspot from a preview page and connected it to a readable article detail page.</w:t>
+      </w:r>
+    </w:p>
+    <w:p>
+      <w:pPr>
+        <w:pStyle w:val="PaperLoopBullet"/>
+      </w:pPr>
+      <w:r>
+        <w:t>The article detail page now carries summary, body text, author context, engagement actions, and discussion access rules.</w:t>
+      </w:r>
+    </w:p>
+    <w:p>
+      <w:pPr>
+        <w:pStyle w:val="PaperLoopBullet"/>
+      </w:pPr>
+      <w:r>
+        <w:t>Firestore now contains a demo article block linked to the uploaded verification edition, proving the upload -&gt; preview -&gt; clip -&gt; read loop.</w:t>
+      </w:r>
+    </w:p>
+    <w:p>
+      <w:pPr>
+        <w:pStyle w:val="Heading1"/>
+      </w:pPr>
+      <w:r>
+        <w:t>Current Ongoing Progress</w:t>
+      </w:r>
+    </w:p>
+    <w:p>
+      <w:pPr>
+        <w:pStyle w:val="PaperLoopBullet"/>
+      </w:pPr>
+      <w:r>
+        <w:t>Adding real newspaper/demo content or a publisher-provided PDF so the hackathon demo has credible edition data.</w:t>
+      </w:r>
+    </w:p>
+    <w:p>
+      <w:pPr>
+        <w:pStyle w:val="PaperLoopBullet"/>
+      </w:pPr>
+      <w:r>
+        <w:t>Refining the reader experience for uploaded editions, page navigation, source preview, and article-mode reading.</w:t>
+      </w:r>
+    </w:p>
+    <w:p>
+      <w:pPr>
+        <w:pStyle w:val="PaperLoopBullet"/>
+      </w:pPr>
+      <w:r>
+        <w:t>Strengthening the publisher admin workflow before adding heavier OCR and automated page extraction.</w:t>
+      </w:r>
+    </w:p>
+    <w:p>
+      <w:pPr>
+        <w:pStyle w:val="PaperLoopBullet"/>
+      </w:pPr>
+      <w:r>
+        <w:t>Preparing the Day 4-5 polish path: demo script, responsive checks, launch checklist, and Sunday deployment readiness.</w:t>
+      </w:r>
+    </w:p>
     <w:p>
       <w:pPr>
         <w:pStyle w:val="Heading1"/>
@@ -2010,12 +2106,7 @@
         <w:spacing w:after="140"/>
       </w:pPr>
       <w:r>
-        <w:rPr>
-          <w:rFonts w:ascii="Inter" w:hAnsi="Inter"/>
-          <w:color w:val="18201D"/>
-          <w:sz w:val="20"/>
-        </w:rPr>
-        <w:t>The next milestone is to move from MVP checkpoint to launch readiness: refine the product surface, verify the complete user journey, prepare deployment, and publish the Sunday launch update with a focused demo and clear ask for feedback.</w:t>
+        <w:t>The next milestone is to move from the Day 3 MVP checkpoint into the Day 4-5 build, refine, and polish window: add credible demo newspaper content, tighten the reader and publisher workflows, verify the complete user journey, and prepare the Sunday launch/deployment update with a focused demo and clear ask for feedback.</w:t>
       </w:r>
     </w:p>
     <w:sectPr>

</xml_diff>